<commit_message>
Add diagrams to folder
</commit_message>
<xml_diff>
--- a/Documentation/Meeting Notes/Meeting Minutes Template.docx
+++ b/Documentation/Meeting Notes/Meeting Minutes Template.docx
@@ -232,8 +232,9 @@
           </w:tcPr>
           <w:p>
             <w:pPr>
+              <w:pStyle w:val="ListParagraph"/>
               <w:spacing w:before="120" w:after="120" w:line="336" w:lineRule="auto"/>
-              <w:ind w:left="720"/>
+              <w:ind w:left="1080"/>
               <w:rPr>
                 <w:rFonts w:ascii="Calibri Light" w:hAnsi="Calibri Light" w:cs="Calibri Light"/>
                 <w:sz w:val="24"/>
@@ -457,11 +458,6 @@
           <w:p>
             <w:pPr>
               <w:spacing w:before="120" w:after="120" w:line="336" w:lineRule="auto"/>
-            </w:pPr>
-          </w:p>
-          <w:p>
-            <w:pPr>
-              <w:spacing w:before="120" w:after="120" w:line="336" w:lineRule="auto"/>
               <w:rPr>
                 <w:rFonts w:ascii="Calibri Light" w:hAnsi="Calibri Light" w:cs="Calibri Light"/>
                 <w:sz w:val="24"/>
@@ -499,7 +495,19 @@
                 <w:sz w:val="28"/>
                 <w:szCs w:val="28"/>
               </w:rPr>
-              <w:t xml:space="preserve">Discussion points </w:t>
+              <w:t xml:space="preserve">Discussion </w:t>
+            </w:r>
+            <w:r>
+              <w:rPr>
+                <w:rFonts w:ascii="Lucida Bright" w:eastAsia="Red Hat Display Bold" w:hAnsi="Lucida Bright" w:cs="Red Hat Display Bold"/>
+                <w:b/>
+                <w:bCs/>
+                <w:color w:val="000000"/>
+                <w:sz w:val="28"/>
+                <w:szCs w:val="28"/>
+              </w:rPr>
+              <w:lastRenderedPageBreak/>
+              <w:t xml:space="preserve">points </w:t>
             </w:r>
           </w:p>
         </w:tc>
@@ -516,16 +524,7 @@
           </w:tcPr>
           <w:p>
             <w:pPr>
-              <w:spacing w:before="120" w:after="120" w:line="336" w:lineRule="auto"/>
-              <w:rPr>
-                <w:rFonts w:ascii="Calibri Light" w:eastAsia="Red Hat Display Bold" w:hAnsi="Calibri Light" w:cs="Calibri Light"/>
-                <w:color w:val="000000"/>
-                <w:sz w:val="24"/>
-              </w:rPr>
-            </w:pPr>
-          </w:p>
-          <w:p>
-            <w:pPr>
+              <w:pStyle w:val="ListParagraph"/>
               <w:spacing w:before="120" w:after="120" w:line="336" w:lineRule="auto"/>
               <w:rPr>
                 <w:rFonts w:ascii="Calibri Light" w:eastAsia="Red Hat Display Bold" w:hAnsi="Calibri Light" w:cs="Calibri Light"/>
@@ -888,6 +887,232 @@
     </w:lvl>
   </w:abstractNum>
   <w:abstractNum w:abstractNumId="2" w15:restartNumberingAfterBreak="0">
+    <w:nsid w:val="61734E8D"/>
+    <w:multiLevelType w:val="hybridMultilevel"/>
+    <w:tmpl w:val="8A6CB22E"/>
+    <w:lvl w:ilvl="0" w:tplc="08090001">
+      <w:start w:val="1"/>
+      <w:numFmt w:val="bullet"/>
+      <w:lvlText w:val=""/>
+      <w:lvlJc w:val="left"/>
+      <w:pPr>
+        <w:ind w:left="1080" w:hanging="360"/>
+      </w:pPr>
+      <w:rPr>
+        <w:rFonts w:ascii="Symbol" w:hAnsi="Symbol" w:hint="default"/>
+      </w:rPr>
+    </w:lvl>
+    <w:lvl w:ilvl="1" w:tplc="08090003" w:tentative="1">
+      <w:start w:val="1"/>
+      <w:numFmt w:val="bullet"/>
+      <w:lvlText w:val="o"/>
+      <w:lvlJc w:val="left"/>
+      <w:pPr>
+        <w:ind w:left="1800" w:hanging="360"/>
+      </w:pPr>
+      <w:rPr>
+        <w:rFonts w:ascii="Courier New" w:hAnsi="Courier New" w:cs="Courier New" w:hint="default"/>
+      </w:rPr>
+    </w:lvl>
+    <w:lvl w:ilvl="2" w:tplc="08090005" w:tentative="1">
+      <w:start w:val="1"/>
+      <w:numFmt w:val="bullet"/>
+      <w:lvlText w:val=""/>
+      <w:lvlJc w:val="left"/>
+      <w:pPr>
+        <w:ind w:left="2520" w:hanging="360"/>
+      </w:pPr>
+      <w:rPr>
+        <w:rFonts w:ascii="Wingdings" w:hAnsi="Wingdings" w:hint="default"/>
+      </w:rPr>
+    </w:lvl>
+    <w:lvl w:ilvl="3" w:tplc="08090001" w:tentative="1">
+      <w:start w:val="1"/>
+      <w:numFmt w:val="bullet"/>
+      <w:lvlText w:val=""/>
+      <w:lvlJc w:val="left"/>
+      <w:pPr>
+        <w:ind w:left="3240" w:hanging="360"/>
+      </w:pPr>
+      <w:rPr>
+        <w:rFonts w:ascii="Symbol" w:hAnsi="Symbol" w:hint="default"/>
+      </w:rPr>
+    </w:lvl>
+    <w:lvl w:ilvl="4" w:tplc="08090003" w:tentative="1">
+      <w:start w:val="1"/>
+      <w:numFmt w:val="bullet"/>
+      <w:lvlText w:val="o"/>
+      <w:lvlJc w:val="left"/>
+      <w:pPr>
+        <w:ind w:left="3960" w:hanging="360"/>
+      </w:pPr>
+      <w:rPr>
+        <w:rFonts w:ascii="Courier New" w:hAnsi="Courier New" w:cs="Courier New" w:hint="default"/>
+      </w:rPr>
+    </w:lvl>
+    <w:lvl w:ilvl="5" w:tplc="08090005" w:tentative="1">
+      <w:start w:val="1"/>
+      <w:numFmt w:val="bullet"/>
+      <w:lvlText w:val=""/>
+      <w:lvlJc w:val="left"/>
+      <w:pPr>
+        <w:ind w:left="4680" w:hanging="360"/>
+      </w:pPr>
+      <w:rPr>
+        <w:rFonts w:ascii="Wingdings" w:hAnsi="Wingdings" w:hint="default"/>
+      </w:rPr>
+    </w:lvl>
+    <w:lvl w:ilvl="6" w:tplc="08090001" w:tentative="1">
+      <w:start w:val="1"/>
+      <w:numFmt w:val="bullet"/>
+      <w:lvlText w:val=""/>
+      <w:lvlJc w:val="left"/>
+      <w:pPr>
+        <w:ind w:left="5400" w:hanging="360"/>
+      </w:pPr>
+      <w:rPr>
+        <w:rFonts w:ascii="Symbol" w:hAnsi="Symbol" w:hint="default"/>
+      </w:rPr>
+    </w:lvl>
+    <w:lvl w:ilvl="7" w:tplc="08090003" w:tentative="1">
+      <w:start w:val="1"/>
+      <w:numFmt w:val="bullet"/>
+      <w:lvlText w:val="o"/>
+      <w:lvlJc w:val="left"/>
+      <w:pPr>
+        <w:ind w:left="6120" w:hanging="360"/>
+      </w:pPr>
+      <w:rPr>
+        <w:rFonts w:ascii="Courier New" w:hAnsi="Courier New" w:cs="Courier New" w:hint="default"/>
+      </w:rPr>
+    </w:lvl>
+    <w:lvl w:ilvl="8" w:tplc="08090005" w:tentative="1">
+      <w:start w:val="1"/>
+      <w:numFmt w:val="bullet"/>
+      <w:lvlText w:val=""/>
+      <w:lvlJc w:val="left"/>
+      <w:pPr>
+        <w:ind w:left="6840" w:hanging="360"/>
+      </w:pPr>
+      <w:rPr>
+        <w:rFonts w:ascii="Wingdings" w:hAnsi="Wingdings" w:hint="default"/>
+      </w:rPr>
+    </w:lvl>
+  </w:abstractNum>
+  <w:abstractNum w:abstractNumId="3" w15:restartNumberingAfterBreak="0">
+    <w:nsid w:val="69537112"/>
+    <w:multiLevelType w:val="hybridMultilevel"/>
+    <w:tmpl w:val="18D2B292"/>
+    <w:lvl w:ilvl="0" w:tplc="08090001">
+      <w:start w:val="1"/>
+      <w:numFmt w:val="bullet"/>
+      <w:lvlText w:val=""/>
+      <w:lvlJc w:val="left"/>
+      <w:pPr>
+        <w:ind w:left="720" w:hanging="360"/>
+      </w:pPr>
+      <w:rPr>
+        <w:rFonts w:ascii="Symbol" w:hAnsi="Symbol" w:hint="default"/>
+      </w:rPr>
+    </w:lvl>
+    <w:lvl w:ilvl="1" w:tplc="08090003" w:tentative="1">
+      <w:start w:val="1"/>
+      <w:numFmt w:val="bullet"/>
+      <w:lvlText w:val="o"/>
+      <w:lvlJc w:val="left"/>
+      <w:pPr>
+        <w:ind w:left="1440" w:hanging="360"/>
+      </w:pPr>
+      <w:rPr>
+        <w:rFonts w:ascii="Courier New" w:hAnsi="Courier New" w:cs="Courier New" w:hint="default"/>
+      </w:rPr>
+    </w:lvl>
+    <w:lvl w:ilvl="2" w:tplc="08090005" w:tentative="1">
+      <w:start w:val="1"/>
+      <w:numFmt w:val="bullet"/>
+      <w:lvlText w:val=""/>
+      <w:lvlJc w:val="left"/>
+      <w:pPr>
+        <w:ind w:left="2160" w:hanging="360"/>
+      </w:pPr>
+      <w:rPr>
+        <w:rFonts w:ascii="Wingdings" w:hAnsi="Wingdings" w:hint="default"/>
+      </w:rPr>
+    </w:lvl>
+    <w:lvl w:ilvl="3" w:tplc="08090001" w:tentative="1">
+      <w:start w:val="1"/>
+      <w:numFmt w:val="bullet"/>
+      <w:lvlText w:val=""/>
+      <w:lvlJc w:val="left"/>
+      <w:pPr>
+        <w:ind w:left="2880" w:hanging="360"/>
+      </w:pPr>
+      <w:rPr>
+        <w:rFonts w:ascii="Symbol" w:hAnsi="Symbol" w:hint="default"/>
+      </w:rPr>
+    </w:lvl>
+    <w:lvl w:ilvl="4" w:tplc="08090003" w:tentative="1">
+      <w:start w:val="1"/>
+      <w:numFmt w:val="bullet"/>
+      <w:lvlText w:val="o"/>
+      <w:lvlJc w:val="left"/>
+      <w:pPr>
+        <w:ind w:left="3600" w:hanging="360"/>
+      </w:pPr>
+      <w:rPr>
+        <w:rFonts w:ascii="Courier New" w:hAnsi="Courier New" w:cs="Courier New" w:hint="default"/>
+      </w:rPr>
+    </w:lvl>
+    <w:lvl w:ilvl="5" w:tplc="08090005" w:tentative="1">
+      <w:start w:val="1"/>
+      <w:numFmt w:val="bullet"/>
+      <w:lvlText w:val=""/>
+      <w:lvlJc w:val="left"/>
+      <w:pPr>
+        <w:ind w:left="4320" w:hanging="360"/>
+      </w:pPr>
+      <w:rPr>
+        <w:rFonts w:ascii="Wingdings" w:hAnsi="Wingdings" w:hint="default"/>
+      </w:rPr>
+    </w:lvl>
+    <w:lvl w:ilvl="6" w:tplc="08090001" w:tentative="1">
+      <w:start w:val="1"/>
+      <w:numFmt w:val="bullet"/>
+      <w:lvlText w:val=""/>
+      <w:lvlJc w:val="left"/>
+      <w:pPr>
+        <w:ind w:left="5040" w:hanging="360"/>
+      </w:pPr>
+      <w:rPr>
+        <w:rFonts w:ascii="Symbol" w:hAnsi="Symbol" w:hint="default"/>
+      </w:rPr>
+    </w:lvl>
+    <w:lvl w:ilvl="7" w:tplc="08090003" w:tentative="1">
+      <w:start w:val="1"/>
+      <w:numFmt w:val="bullet"/>
+      <w:lvlText w:val="o"/>
+      <w:lvlJc w:val="left"/>
+      <w:pPr>
+        <w:ind w:left="5760" w:hanging="360"/>
+      </w:pPr>
+      <w:rPr>
+        <w:rFonts w:ascii="Courier New" w:hAnsi="Courier New" w:cs="Courier New" w:hint="default"/>
+      </w:rPr>
+    </w:lvl>
+    <w:lvl w:ilvl="8" w:tplc="08090005" w:tentative="1">
+      <w:start w:val="1"/>
+      <w:numFmt w:val="bullet"/>
+      <w:lvlText w:val=""/>
+      <w:lvlJc w:val="left"/>
+      <w:pPr>
+        <w:ind w:left="6480" w:hanging="360"/>
+      </w:pPr>
+      <w:rPr>
+        <w:rFonts w:ascii="Wingdings" w:hAnsi="Wingdings" w:hint="default"/>
+      </w:rPr>
+    </w:lvl>
+  </w:abstractNum>
+  <w:abstractNum w:abstractNumId="4" w15:restartNumberingAfterBreak="0">
     <w:nsid w:val="776F419B"/>
     <w:multiLevelType w:val="multilevel"/>
     <w:tmpl w:val="FFFFFFFF"/>
@@ -1009,7 +1234,7 @@
       </w:pPr>
     </w:lvl>
   </w:abstractNum>
-  <w:abstractNum w:abstractNumId="3" w15:restartNumberingAfterBreak="0">
+  <w:abstractNum w:abstractNumId="5" w15:restartNumberingAfterBreak="0">
     <w:nsid w:val="7D951579"/>
     <w:multiLevelType w:val="multilevel"/>
     <w:tmpl w:val="FFFFFFFF"/>
@@ -1150,7 +1375,7 @@
     </w:lvl>
   </w:abstractNum>
   <w:num w:numId="1" w16cid:durableId="17050025">
-    <w:abstractNumId w:val="3"/>
+    <w:abstractNumId w:val="5"/>
   </w:num>
   <w:num w:numId="2" w16cid:durableId="1869295079">
     <w:abstractNumId w:val="1"/>
@@ -1159,7 +1384,13 @@
     <w:abstractNumId w:val="0"/>
   </w:num>
   <w:num w:numId="4" w16cid:durableId="581186508">
+    <w:abstractNumId w:val="4"/>
+  </w:num>
+  <w:num w:numId="5" w16cid:durableId="2144153091">
     <w:abstractNumId w:val="2"/>
+  </w:num>
+  <w:num w:numId="6" w16cid:durableId="154541490">
+    <w:abstractNumId w:val="3"/>
   </w:num>
 </w:numbering>
 </file>
@@ -1652,6 +1883,20 @@
       <w:suppressLineNumbers/>
     </w:pPr>
   </w:style>
+  <w:style w:type="paragraph" w:styleId="ListParagraph">
+    <w:name w:val="List Paragraph"/>
+    <w:basedOn w:val="Normal"/>
+    <w:uiPriority w:val="34"/>
+    <w:qFormat/>
+    <w:rsid w:val="00184938"/>
+    <w:pPr>
+      <w:ind w:left="720"/>
+      <w:contextualSpacing/>
+    </w:pPr>
+    <w:rPr>
+      <w:rFonts w:cs="Mangal"/>
+    </w:rPr>
+  </w:style>
 </w:styles>
 </file>
 

</xml_diff>